<commit_message>
Yukti 0.3.0: self-contained server, desktop app, admin-only LLM config, HOD-only data, no invented data
- yukti-server.exe (PyInstaller) with bundled llama.cpp CUDA/Vulkan, model and pre-trained Laya; auto GPU backend
- Electron desktop client (plant-server or all-in-one mode launching the bundled server)
- Admin: users (CSV import, reset, disable), org AI settings, usage & health (measured only), feedback, backups/restore, model import, Laya benchmark
- Auth: forced password change, TOTP MFA with recovery codes
- Only HODs add/remove documents, only for their own department
- Findings workflow with per-role allowed actions; grey theme; Hindi/Kannada UI
- Removed invented data: 15 EXAMPLE documents (watermarked, badged), real MRPL departments, optimizer runs only on planner-entered model
- e2e suite: 74 checks
</commit_message>
<xml_diff>
--- a/data/corpus/SOP-EL-014_rev2.docx
+++ b/data/corpus/SOP-EL-014_rev2.docx
@@ -735,7 +735,7 @@
       <w:jc w:val="center"/>
     </w:pPr>
     <w:r>
-      <w:t>SYNTHETIC – SIH DEMO  |  Fictional data – not MRPL  |  Uncontrolled when printed</w:t>
+      <w:t>EXAMPLE – prepared by Team UniMinds – NOT MRPL DATA  |  Fictional data – not MRPL  |  Uncontrolled when printed</w:t>
     </w:r>
   </w:p>
 </w:ftr>
@@ -748,7 +748,7 @@
       <w:pStyle w:val="Header"/>
     </w:pPr>
     <w:r>
-      <w:t>Yukti Refinery – CDU-1  |  SOP-EL-014  |  Rev 2  |  INTERNAL</w:t>
+      <w:t>Example Plant – CDU-1  |  SOP-EL-014  |  Rev 2  |  INTERNAL</w:t>
     </w:r>
   </w:p>
 </w:hdr>

</xml_diff>